<commit_message>
updated table 1, added in more variables for prevalence, updated the working paper to mention how I got the prevalnce data
</commit_message>
<xml_diff>
--- a/working_paper/Unraveling the Influence of Political Environments on Health Behaviors during COVID-19 PAPER.docx
+++ b/working_paper/Unraveling the Influence of Political Environments on Health Behaviors during COVID-19 PAPER.docx
@@ -939,6 +939,30 @@
     </w:p>
     <w:p>
       <w:pPr>
+        <w:ind w:firstLine="720"/>
+        <w:rPr>
+          <w:rFonts w:ascii="Arial" w:eastAsia="Times New Roman" w:hAnsi="Arial" w:cs="Arial"/>
+          <w:color w:val="000000"/>
+          <w:kern w:val="0"/>
+          <w:sz w:val="22"/>
+          <w:szCs w:val="22"/>
+          <w14:ligatures w14:val="none"/>
+        </w:rPr>
+      </w:pPr>
+      <w:r>
+        <w:rPr>
+          <w:rFonts w:ascii="Arial" w:eastAsia="Times New Roman" w:hAnsi="Arial" w:cs="Arial"/>
+          <w:color w:val="000000"/>
+          <w:kern w:val="0"/>
+          <w:sz w:val="22"/>
+          <w:szCs w:val="22"/>
+          <w14:ligatures w14:val="none"/>
+        </w:rPr>
+        <w:t>Prevalence rates were obtained from the Johns Hopkins county-level COVID-19 tracker. Archived GitHub commits were utilized to access historical prevalence data, ensuring the retrieval of information as it was contemporaneously reported and received by the public.</w:t>
+      </w:r>
+    </w:p>
+    <w:p>
+      <w:pPr>
         <w:rPr>
           <w:rFonts w:ascii="Arial" w:eastAsia="Times New Roman" w:hAnsi="Arial" w:cs="Arial"/>
           <w:b/>
@@ -1128,7 +1152,19 @@
           <w:szCs w:val="22"/>
           <w14:ligatures w14:val="none"/>
         </w:rPr>
-        <w:t xml:space="preserve">In its early stages, this research is already shedding light on the complex relationship between individual health behaviors and the surrounding political landscape, particularly exploring the propensity for diminished health-conscious behaviors in politically contrasting environments. Preliminary results indicate a steadfast low level of COVID-19 concern among </w:t>
+        <w:t xml:space="preserve">In its early stages, this research is already shedding light on the complex relationship between individual health behaviors and the surrounding political landscape, particularly exploring the propensity for diminished health-conscious behaviors in politically contrasting environments. </w:t>
+      </w:r>
+      <w:r>
+        <w:rPr>
+          <w:rFonts w:ascii="Arial" w:eastAsia="Times New Roman" w:hAnsi="Arial" w:cs="Arial"/>
+          <w:color w:val="000000"/>
+          <w:kern w:val="0"/>
+          <w:sz w:val="22"/>
+          <w:szCs w:val="22"/>
+          <w14:ligatures w14:val="none"/>
+        </w:rPr>
+        <w:lastRenderedPageBreak/>
+        <w:t xml:space="preserve">Preliminary results indicate a steadfast low level of COVID-19 concern among </w:t>
       </w:r>
       <w:proofErr w:type="gramStart"/>
       <w:r>
@@ -1176,19 +1212,7 @@
           <w:szCs w:val="22"/>
           <w14:ligatures w14:val="none"/>
         </w:rPr>
-        <w:t xml:space="preserve"> by residing in Democrat-led districts. Contrastingly, evidence of peer effects </w:t>
-      </w:r>
-      <w:r>
-        <w:rPr>
-          <w:rFonts w:ascii="Arial" w:eastAsia="Times New Roman" w:hAnsi="Arial" w:cs="Arial"/>
-          <w:color w:val="000000"/>
-          <w:kern w:val="0"/>
-          <w:sz w:val="22"/>
-          <w:szCs w:val="22"/>
-          <w14:ligatures w14:val="none"/>
-        </w:rPr>
-        <w:lastRenderedPageBreak/>
-        <w:t xml:space="preserve">emerges, with noticeable alterations in face-to-face interactions for individuals residing in politically discordant districts. </w:t>
+        <w:t xml:space="preserve"> by residing in Democrat-led districts. Contrastingly, evidence of peer effects emerges, with noticeable alterations in face-to-face interactions for individuals residing in politically discordant districts. </w:t>
       </w:r>
     </w:p>
     <w:p>
@@ -1855,7 +1879,7 @@
           <w14:ligatures w14:val="none"/>
         </w:rPr>
         <w:drawing>
-          <wp:inline distT="0" distB="0" distL="0" distR="0" wp14:anchorId="34A4BE9B" wp14:editId="4BD19B55">
+          <wp:inline distT="0" distB="0" distL="0" distR="0" wp14:anchorId="34A4BE9B" wp14:editId="29CA1365">
             <wp:extent cx="5943600" cy="3343275"/>
             <wp:effectExtent l="0" t="0" r="0" b="0"/>
             <wp:docPr id="587462866" name="Picture 2" descr="A graph of a bar chart&#10;&#10;Description automatically generated with medium confidence"/>
@@ -3108,7 +3132,6 @@
   <w:style w:type="character" w:default="1" w:styleId="DefaultParagraphFont">
     <w:name w:val="Default Paragraph Font"/>
     <w:uiPriority w:val="1"/>
-    <w:semiHidden/>
     <w:unhideWhenUsed/>
   </w:style>
   <w:style w:type="table" w:default="1" w:styleId="TableNormal">

</xml_diff>